<commit_message>
Actualizacion dashboard mié 29/07/2026 13:01:57,92
</commit_message>
<xml_diff>
--- a/Prompt/Instrucciones_Proyecto.docx
+++ b/Prompt/Instrucciones_Proyecto.docx
@@ -29,7 +29,7 @@
           <w:sz w:val="19"/>
           <w:szCs w:val="19"/>
         </w:rPr>
-        <w:t xml:space="preserve">Cowork · Proyecto "Reporte Taller BV" · Electroestrada · 27/07/2026</w:t>
+        <w:t xml:space="preserve">Cowork · Proyecto "Reporte Taller BV" · Electroestrada · 29/07/2026</w:t>
       </w:r>
     </w:p>
     <w:p>
@@ -1164,7 +1164,7 @@
           <w:sz w:val="19"/>
           <w:szCs w:val="19"/>
         </w:rPr>
-        <w:t xml:space="preserve">Los objetivos (mensuales y semanales) se leen siempre del sheet (fila 1 de cada hoja OF-*). Los semanales se redondean al entero. Cambian mes a mes y se recalculan dinámicamente.</w:t>
+        <w:t xml:space="preserve">Los objetivos (mensuales y semanales) se leen siempre del sheet (fila 1 de cada hoja OF-*). Los semanales se redondean al entero. Cambian mes a mes. Los objetivos semanales van ANTES del label 'Objetivo &lt;Mes&gt;' (entre el objetivo del mes anterior y el de este mes).</w:t>
       </w:r>
     </w:p>
     <w:p>
@@ -1380,7 +1380,7 @@
           <w:sz w:val="19"/>
           <w:szCs w:val="19"/>
         </w:rPr>
-        <w:t xml:space="preserve">La tarjeta General y las solapas por GA usan el MISMO criterio: % prom = (días prom − 3) / 3, con el promedio de días SIN redondear (aunque se muestre 2.86). Verde = adelanto, rojo = retraso. Implementación: en pedidosGeneralSummary, _demTot = (_dpRaw − 3) / 3 con _dpRaw = promedio de dias_prod (no null). Antes la tarjeta General usaba avgDemDP. NO afecta al % Servicio, que usa avgDem (demora de entrega, con estimados para vencidos sin fecha real).</w:t>
+        <w:t xml:space="preserve">La tarjeta General y las solapas por GA usan el MISMO criterio: % prom = (días prom − 3) / 3, con el promedio de días SIN redondear. Verde = adelanto, rojo = retraso. Antes la tarjeta General usaba avgDemDP. NO afecta al % Servicio, que usa avgDem (demora de entrega, con estimados para vencidos sin fecha real).</w:t>
       </w:r>
     </w:p>
     <w:p>
@@ -1395,6 +1395,33 @@
           <w:sz w:val="21"/>
           <w:szCs w:val="21"/>
         </w:rPr>
+        <w:t xml:space="preserve">Días prom. y % prom.: solo entregados (29/07/2026)</w:t>
+      </w:r>
+    </w:p>
+    <w:p>
+      <w:pPr>
+        <w:spacing w:after="80"/>
+      </w:pPr>
+      <w:r>
+        <w:rPr>
+          <w:sz w:val="19"/>
+          <w:szCs w:val="19"/>
+        </w:rPr>
+        <w:t xml:space="preserve">Días prod. prom., % prom. y avgDemDP se calculan SOLO sobre pedidos ENTREGADOS (con fecha de entrega real). Los pedidos en proceso NO cuentan; si un GA/condición no tiene entregados, se muestra '—'. Evita mostrar adelanto/retraso de artículos aún en fabricación. Helpers en el HTML: entregadoP(p), dpProm(arr).</w:t>
+      </w:r>
+    </w:p>
+    <w:p>
+      <w:pPr>
+        <w:spacing w:after="40" w:before="180"/>
+      </w:pPr>
+      <w:r>
+        <w:rPr>
+          <w:b/>
+          <w:bCs/>
+          <w:color w:val="3a5bbf"/>
+          <w:sz w:val="21"/>
+          <w:szCs w:val="21"/>
+        </w:rPr>
         <w:t xml:space="preserve">Sincronizar carpeta del proyecto</w:t>
       </w:r>
     </w:p>
@@ -1407,7 +1434,7 @@
           <w:sz w:val="19"/>
           <w:szCs w:val="19"/>
         </w:rPr>
-        <w:t xml:space="preserve">Cada vez que se actualice memoria, prompt o una skill, reflejar el cambio en los archivos de la carpeta Desktop\Claude\Reportes\Taller BV (Memoria/, Skills/ y este documento) y regenerar sus PDF.</w:t>
+        <w:t xml:space="preserve">Cada vez que se actualice memoria, prompt o una skill, reflejar el cambio en los archivos de la carpeta Desktop\Claude\Reportes\Taller BV (Prompt/Instrucciones_Proyecto.docx, Skills/) y regenerar sus PDF.</w:t>
       </w:r>
     </w:p>
     <w:p>

</xml_diff>